<commit_message>
Release 1.37.0 — Editable document previews, independent scrutiny year, Tender Document GST from estimate
File Backer, Work Order, Agreement Bond, QCC Intimation and the Give
Intimation letter now open as editors: a fields pane (shared
DocFieldsEditor) beside the live docx page. Hand-typed overrides are
merged over the derived values at the single fill choke point, so the
tile, Word, PDF, Print, Download all and Verify agree. Edits are marked,
revertable per field, and cleared when the work changes.

Note Submitted note 2 carries its own data year instead of reusing note
1's administrative sanction financial year. Agreement Bond drops the tab
before the name of the work. The Tender Document's reimbursable page
prints the estimate's own GST amount when one was read from the uploaded
estimate, falling back to 18% of the ECV.

Co-Authored-By: Claude Opus 5 <noreply@anthropic.com>
</commit_message>
<xml_diff>
--- a/resources/work-order-template-header2.docx
+++ b/resources/work-order-template-header2.docx
@@ -305,6 +305,7 @@
           <w:kern w:val="0"/>
           <w:sz w:val="21"/>
           <w:szCs w:val="21"/>
+          <w:u w:val="single"/>
           <w:lang w:val="en-US"/>
           <w14:ligatures w14:val="none"/>
         </w:rPr>
@@ -318,6 +319,7 @@
           <w:kern w:val="0"/>
           <w:sz w:val="21"/>
           <w:szCs w:val="21"/>
+          <w:u w:val="single"/>
           <w:lang w:val="en-US"/>
           <w14:ligatures w14:val="none"/>
         </w:rPr>
@@ -332,6 +334,7 @@
           <w:kern w:val="0"/>
           <w:sz w:val="21"/>
           <w:szCs w:val="21"/>
+          <w:u w:val="single"/>
           <w:lang w:val="en-US"/>
           <w14:ligatures w14:val="none"/>
         </w:rPr>
@@ -345,6 +348,7 @@
           <w:kern w:val="0"/>
           <w:sz w:val="21"/>
           <w:szCs w:val="21"/>
+          <w:u w:val="single"/>
           <w:lang w:val="en-US"/>
           <w14:ligatures w14:val="none"/>
         </w:rPr>
@@ -359,6 +363,7 @@
           <w:kern w:val="0"/>
           <w:sz w:val="21"/>
           <w:szCs w:val="21"/>
+          <w:u w:val="single"/>
           <w:lang w:val="en-US"/>
           <w14:ligatures w14:val="none"/>
         </w:rPr>
@@ -372,6 +377,7 @@
           <w:kern w:val="0"/>
           <w:sz w:val="21"/>
           <w:szCs w:val="21"/>
+          <w:u w:val="single"/>
           <w:lang w:val="en-US"/>
           <w14:ligatures w14:val="none"/>
         </w:rPr>
@@ -386,6 +392,7 @@
           <w:sz w:val="21"/>
           <w:szCs w:val="21"/>
           <w14:ligatures w14:val="none"/>
+          <w:u w:val="single"/>
         </w:rPr>
         <w:t>{{Corporation}}/{{ZoneAbbr}}/</w:t>
       </w:r>
@@ -398,6 +405,7 @@
           <w:sz w:val="21"/>
           <w:szCs w:val="21"/>
           <w14:ligatures w14:val="none"/>
+          <w:u w:val="single"/>
         </w:rPr>
         <w:t>{{Circle}}</w:t>
       </w:r>
@@ -410,6 +418,7 @@
           <w:sz w:val="21"/>
           <w:szCs w:val="21"/>
           <w14:ligatures w14:val="none"/>
+          <w:u w:val="single"/>
         </w:rPr>
         <w:t>/CIR-</w:t>
       </w:r>
@@ -422,6 +431,7 @@
           <w:sz w:val="21"/>
           <w:szCs w:val="21"/>
           <w14:ligatures w14:val="none"/>
+          <w:u w:val="single"/>
         </w:rPr>
         <w:t>{{CNO}}</w:t>
       </w:r>
@@ -434,6 +444,7 @@
           <w:sz w:val="21"/>
           <w:szCs w:val="21"/>
           <w14:ligatures w14:val="none"/>
+          <w:u w:val="single"/>
         </w:rPr>
         <w:t>/EE/</w:t>
       </w:r>
@@ -446,6 +457,7 @@
           <w:sz w:val="21"/>
           <w:szCs w:val="21"/>
           <w14:ligatures w14:val="none"/>
+          <w:u w:val="single"/>
         </w:rPr>
         <w:t>{{</w:t>
       </w:r>
@@ -459,6 +471,7 @@
           <w:sz w:val="21"/>
           <w:szCs w:val="21"/>
           <w14:ligatures w14:val="none"/>
+          <w:u w:val="single"/>
         </w:rPr>
         <w:t>Financialyear</w:t>
       </w:r>
@@ -473,6 +486,7 @@
           <w:sz w:val="21"/>
           <w:szCs w:val="21"/>
           <w14:ligatures w14:val="none"/>
+          <w:u w:val="single"/>
         </w:rPr>
         <w:t>}}</w:t>
       </w:r>
@@ -486,6 +500,7 @@
           <w:kern w:val="0"/>
           <w:sz w:val="21"/>
           <w:szCs w:val="21"/>
+          <w:u w:val="single"/>
           <w:lang w:val="en-US"/>
           <w14:ligatures w14:val="none"/>
         </w:rPr>
@@ -499,6 +514,7 @@
           <w:kern w:val="0"/>
           <w:sz w:val="21"/>
           <w:szCs w:val="21"/>
+          <w:u w:val="single"/>
           <w:lang w:val="en-US"/>
           <w14:ligatures w14:val="none"/>
         </w:rPr>
@@ -513,6 +529,7 @@
           <w:kern w:val="0"/>
           <w:sz w:val="21"/>
           <w:szCs w:val="21"/>
+          <w:u w:val="single"/>
           <w:lang w:val="en-US"/>
           <w14:ligatures w14:val="none"/>
         </w:rPr>
@@ -527,6 +544,7 @@
           <w:kern w:val="0"/>
           <w:sz w:val="21"/>
           <w:szCs w:val="21"/>
+          <w:u w:val="single"/>
           <w:lang w:val="en-US"/>
           <w14:ligatures w14:val="none"/>
         </w:rPr>

</xml_diff>